<commit_message>
Meeting log 2-9-26 through 2-15-26
</commit_message>
<xml_diff>
--- a/documentation/Meeting Logs/Meeting 2-1-26 through 2-8-26.docx
+++ b/documentation/Meeting Logs/Meeting 2-1-26 through 2-8-26.docx
@@ -1196,6 +1196,13 @@
         </w:rPr>
         <w:t>Meeting 4</w:t>
       </w:r>
+      <w:r>
+        <w:rPr>
+          <w:sz w:val="22"/>
+          <w:szCs w:val="22"/>
+        </w:rPr>
+        <w:t xml:space="preserve">: Just catch and make sure that everything works with then function and more. </w:t>
+      </w:r>
     </w:p>
     <w:p>
       <w:pPr>
@@ -1484,23 +1491,7 @@
           <w:sz w:val="16"/>
           <w:szCs w:val="16"/>
         </w:rPr>
-        <w:t xml:space="preserve">Since this is a small project, you may not have formal ownership roles. Instead, list the team </w:t>
-      </w:r>
-      <w:proofErr w:type="gramStart"/>
-      <w:r>
-        <w:rPr>
-          <w:sz w:val="16"/>
-          <w:szCs w:val="16"/>
-        </w:rPr>
-        <w:t>member</w:t>
-      </w:r>
-      <w:proofErr w:type="gramEnd"/>
-      <w:r>
-        <w:rPr>
-          <w:sz w:val="16"/>
-          <w:szCs w:val="16"/>
-        </w:rPr>
-        <w:t xml:space="preserve"> assigned to each action item. In larger projects, ownership and assignment are typically separate roles.</w:t>
+        <w:t>Since this is a small project, you may not have formal ownership roles. Instead, list the team member assigned to each action item. In larger projects, ownership and assignment are typically separate roles.</w:t>
       </w:r>
     </w:p>
     <w:tbl>

</xml_diff>